<commit_message>
docs: fjern em dash, semikolon og separeringsbindestreger fra rapport
</commit_message>
<xml_diff>
--- a/docs/rapport.docx
+++ b/docs/rapport.docx
@@ -2,13 +2,13 @@
 <file path=word/document.xml><?xml version="1.0" encoding="utf-8"?>
 <w:document xmlns:w="http://schemas.openxmlformats.org/wordprocessingml/2006/main" xmlns:m="http://schemas.openxmlformats.org/officeDocument/2006/math" xmlns:r="http://schemas.openxmlformats.org/officeDocument/2006/relationships" xmlns:o="urn:schemas-microsoft-com:office:office" xmlns:v="urn:schemas-microsoft-com:vml" xmlns:w10="urn:schemas-microsoft-com:office:word" xmlns:a="http://schemas.openxmlformats.org/drawingml/2006/main" xmlns:pic="http://schemas.openxmlformats.org/drawingml/2006/picture" xmlns:wp="http://schemas.openxmlformats.org/drawingml/2006/wordprocessingDrawing">
   <w:body>
-    <w:bookmarkStart w:id="37" w:name="plotplanner---rapport"/>
+    <w:bookmarkStart w:id="37" w:name="plotplanner-rapport"/>
     <w:p>
       <w:pPr>
         <w:pStyle w:val="Heading1"/>
       </w:pPr>
       <w:r>
-        <w:t xml:space="preserve">PlotPlanner - Rapport</w:t>
+        <w:t xml:space="preserve">PlotPlanner: Rapport</w:t>
       </w:r>
     </w:p>
     <w:bookmarkStart w:id="21" w:name="platform-arkitektur-og-modelreflektion"/>
@@ -66,13 +66,7 @@
         <w:t xml:space="preserve"> </w:t>
       </w:r>
       <w:r>
-        <w:t xml:space="preserve">NanoClaw. Den primære begrundelse er at Hermes er model-agnostisk —</w:t>
-      </w:r>
-      <w:r>
-        <w:t xml:space="preserve"> </w:t>
-      </w:r>
-      <w:r>
-        <w:t xml:space="preserve">agenten er ikke bundet til én LLM-udbyder og kan skifte model uden at</w:t>
+        <w:t xml:space="preserve">NanoClaw. Den primære begrundelse er at Hermes er model-agnostisk, agenten er ikke bundet til én LLM-udbyder og kan skifte model uden at</w:t>
       </w:r>
       <w:r>
         <w:t xml:space="preserve"> </w:t>
@@ -125,7 +119,7 @@
         <w:t xml:space="preserve"> </w:t>
       </w:r>
       <w:r>
-        <w:t xml:space="preserve">gateway til Telegram — hvilket eliminerede behovet for en separat n8n</w:t>
+        <w:t xml:space="preserve">gateway til Telegram, hvilket eliminerede behovet for en separat n8n</w:t>
       </w:r>
       <w:r>
         <w:t xml:space="preserve"> </w:t>
@@ -151,7 +145,7 @@
         <w:t xml:space="preserve"> </w:t>
       </w:r>
       <w:r>
-        <w:t xml:space="preserve">agent-sessioner i isolerede Docker-containere — det er primært</w:t>
+        <w:t xml:space="preserve">agent-sessioner i isolerede Docker-containere. Det er primært</w:t>
       </w:r>
       <w:r>
         <w:t xml:space="preserve"> </w:t>
@@ -175,7 +169,7 @@
         <w:t xml:space="preserve"> </w:t>
       </w:r>
       <w:r>
-        <w:t xml:space="preserve">via konfiguration, og har en built-in gateway til Telegram — hvilket</w:t>
+        <w:t xml:space="preserve">via konfiguration, og har en built-in gateway til Telegram, hvilket</w:t>
       </w:r>
       <w:r>
         <w:t xml:space="preserve"> </w:t>
@@ -231,14 +225,14 @@
     <w:tbl>
       <w:tblPr>
         <w:tblStyle w:val="Table"/>
-        <w:tblW w:type="pct" w:w="4877"/>
+        <w:tblW w:type="pct" w:w="4868"/>
         <w:tblLayout w:type="fixed"/>
         <w:tblLook w:firstRow="1" w:lastRow="0" w:firstColumn="0" w:lastColumn="0" w:noHBand="0" w:noVBand="0" w:val="0020"/>
       </w:tblPr>
       <w:tblGrid>
-        <w:gridCol w:w="1857"/>
-        <w:gridCol w:w="1564"/>
-        <w:gridCol w:w="4302"/>
+        <w:gridCol w:w="1980"/>
+        <w:gridCol w:w="1563"/>
+        <w:gridCol w:w="4168"/>
       </w:tblGrid>
       <w:tr>
         <w:trPr>
@@ -332,19 +326,25 @@
               <w:jc w:val="left"/>
             </w:pPr>
             <w:r>
-              <w:t xml:space="preserve">Hallucinererede og kaldte aldrig MCP tools.</w:t>
+              <w:t xml:space="preserve">Hallucinererede og kaldte aldrig MCP</w:t>
             </w:r>
             <w:r>
               <w:t xml:space="preserve"> </w:t>
             </w:r>
             <w:r>
-              <w:t xml:space="preserve">Returnerede meningsløse svar i stedet for</w:t>
+              <w:t xml:space="preserve">tools. Returnerede meningsløse svar i</w:t>
             </w:r>
             <w:r>
               <w:t xml:space="preserve"> </w:t>
             </w:r>
             <w:r>
-              <w:t xml:space="preserve">at bruge de eksponerede tools.</w:t>
+              <w:t xml:space="preserve">stedet for at bruge de eksponerede</w:t>
+            </w:r>
+            <w:r>
+              <w:t xml:space="preserve"> </w:t>
+            </w:r>
+            <w:r>
+              <w:t xml:space="preserve">tools.</w:t>
             </w:r>
           </w:p>
         </w:tc>
@@ -394,13 +394,13 @@
               <w:t xml:space="preserve"> </w:t>
             </w:r>
             <w:r>
-              <w:t xml:space="preserve">agentisk brug. Samme problem som llama3.1</w:t>
+              <w:t xml:space="preserve">agentisk brug. Samme problem som</w:t>
             </w:r>
             <w:r>
               <w:t xml:space="preserve"> </w:t>
             </w:r>
             <w:r>
-              <w:t xml:space="preserve">og ingen tool-calling.</w:t>
+              <w:t xml:space="preserve">llama3.1 og ingen tool-calling.</w:t>
             </w:r>
           </w:p>
         </w:tc>
@@ -444,13 +444,19 @@
               <w:jc w:val="left"/>
             </w:pPr>
             <w:r>
-              <w:t xml:space="preserve">Afvist af Hermes grundet context window på</w:t>
+              <w:t xml:space="preserve">Afvist af Hermes grundet context window</w:t>
             </w:r>
             <w:r>
               <w:t xml:space="preserve"> </w:t>
             </w:r>
             <w:r>
-              <w:t xml:space="preserve">32K tokens, under Hermes’ minimum på 64K.</w:t>
+              <w:t xml:space="preserve">på 32K tokens, under Hermes’ minimum på</w:t>
+            </w:r>
+            <w:r>
+              <w:t xml:space="preserve"> </w:t>
+            </w:r>
+            <w:r>
+              <w:t xml:space="preserve">64K.</w:t>
             </w:r>
           </w:p>
         </w:tc>
@@ -500,13 +506,19 @@
               <w:t xml:space="preserve"> </w:t>
             </w:r>
             <w:r>
-              <w:t xml:space="preserve">tool-calling. Gratis tier utilstrækkelig</w:t>
+              <w:t xml:space="preserve">tool-calling. Gratis tier</w:t>
             </w:r>
             <w:r>
               <w:t xml:space="preserve"> </w:t>
             </w:r>
             <w:r>
-              <w:t xml:space="preserve">(rate limits) — billing aktiveret, cap 50 kr/md.</w:t>
+              <w:t xml:space="preserve">utilstrækkelig (rate limits). Billing</w:t>
+            </w:r>
+            <w:r>
+              <w:t xml:space="preserve"> </w:t>
+            </w:r>
+            <w:r>
+              <w:t xml:space="preserve">aktiveret, cap 50 kr/md.</w:t>
             </w:r>
           </w:p>
         </w:tc>
@@ -701,13 +713,7 @@
         <w:t xml:space="preserve"> </w:t>
       </w:r>
       <w:r>
-        <w:t xml:space="preserve">(Pinecone, Weaviate el.lign.) og en separat graph-database — to</w:t>
-      </w:r>
-      <w:r>
-        <w:t xml:space="preserve"> </w:t>
-      </w:r>
-      <w:r>
-        <w:t xml:space="preserve">systemer at drifte og vedligeholde. Med Neo4j samles begge i én</w:t>
+        <w:t xml:space="preserve">(Pinecone, Weaviate el.lign.) og en separat graph-database. To systemer at drifte og vedligeholde. Med Neo4j samles begge i én</w:t>
       </w:r>
       <w:r>
         <w:t xml:space="preserve"> </w:t>
@@ -727,7 +733,7 @@
         <w:t xml:space="preserve"> </w:t>
       </w:r>
       <w:r>
-        <w:t xml:space="preserve">similarity. Threshold er sat til 0.7 — lavere returnerer for støjede</w:t>
+        <w:t xml:space="preserve">similarity. Threshold er sat til 0.7. Lavere returnerer for støjede</w:t>
       </w:r>
       <w:r>
         <w:t xml:space="preserve"> </w:t>
@@ -763,7 +769,7 @@
         <w:t xml:space="preserve"> </w:t>
       </w:r>
       <w:r>
-        <w:t xml:space="preserve">manuelt inden Neo4j-skrivning — et human-in-the-loop trin der fanger</w:t>
+        <w:t xml:space="preserve">manuelt inden Neo4j-skrivning, et human-in-the-loop trin der fanger</w:t>
       </w:r>
       <w:r>
         <w:t xml:space="preserve"> </w:t>
@@ -848,7 +854,7 @@
         <w:t xml:space="preserve"> </w:t>
       </w:r>
       <w:r>
-        <w:t xml:space="preserve">multilingual). Modellen understøtter dansk input implicit — brugeren</w:t>
+        <w:t xml:space="preserve">multilingual). Modellen understøtter dansk input implicit. Brugeren</w:t>
       </w:r>
       <w:r>
         <w:t xml:space="preserve"> </w:t>
@@ -938,19 +944,19 @@
         <w:rPr>
           <w:rStyle w:val="VerbatimChar"/>
         </w:rPr>
-        <w:t xml:space="preserve">Accept: application/json, text/event-stream</w:t>
-      </w:r>
-      <w:r>
-        <w:t xml:space="preserve"> </w:t>
-      </w:r>
-      <w:r>
-        <w:t xml:space="preserve">header — løst ved at</w:t>
-      </w:r>
-      <w:r>
-        <w:t xml:space="preserve"> </w:t>
-      </w:r>
-      <w:r>
-        <w:t xml:space="preserve">patche headeren i Express middleware inden transport-håndtering.</w:t>
+        <w:t xml:space="preserve">Accept: ``application``/``json``, ``text``/event-stream</w:t>
+      </w:r>
+      <w:r>
+        <w:t xml:space="preserve"> </w:t>
+      </w:r>
+      <w:r>
+        <w:t xml:space="preserve">header, løst ved at patche headeren i Express middleware inden</w:t>
+      </w:r>
+      <w:r>
+        <w:t xml:space="preserve"> </w:t>
+      </w:r>
+      <w:r>
+        <w:t xml:space="preserve">transport-håndtering.</w:t>
       </w:r>
     </w:p>
     <w:p>
@@ -1099,7 +1105,7 @@
         <w:rPr>
           <w:rStyle w:val="VerbatimChar"/>
         </w:rPr>
-        <w:t xml:space="preserve">context="companion"</w:t>
+        <w:t xml:space="preserve">context``="``companion``"</w:t>
       </w:r>
       <w:r>
         <w:t xml:space="preserve"> </w:t>
@@ -1114,7 +1120,7 @@
         <w:rPr>
           <w:rStyle w:val="VerbatimChar"/>
         </w:rPr>
-        <w:t xml:space="preserve">context="cultivation"</w:t>
+        <w:t xml:space="preserve">context``="``cultivation``"</w:t>
       </w:r>
       <w:r>
         <w:t xml:space="preserve">),</w:t>
@@ -1138,16 +1144,16 @@
         <w:t xml:space="preserve"> </w:t>
       </w:r>
       <w:r>
-        <w:t xml:space="preserve">“hvad kan jeg plante”</w:t>
-      </w:r>
-      <w:r>
-        <w:t xml:space="preserve">-spørgsmål med sæson og/eller</w:t>
-      </w:r>
-      <w:r>
-        <w:t xml:space="preserve"> </w:t>
-      </w:r>
-      <w:r>
-        <w:t xml:space="preserve">jordtype,</w:t>
+        <w:t xml:space="preserve">“hvad kan jeg</w:t>
+      </w:r>
+      <w:r>
+        <w:t xml:space="preserve"> </w:t>
+      </w:r>
+      <w:r>
+        <w:t xml:space="preserve">plante”</w:t>
+      </w:r>
+      <w:r>
+        <w:t xml:space="preserve">-spørgsmål med sæson og/eller jordtype,</w:t>
       </w:r>
       <w:r>
         <w:t xml:space="preserve"> </w:t>
@@ -1162,7 +1168,13 @@
         <w:t xml:space="preserve"> </w:t>
       </w:r>
       <w:r>
-        <w:t xml:space="preserve">til åbne spørgsmål uden navngivet plante.</w:t>
+        <w:t xml:space="preserve">til åbne</w:t>
+      </w:r>
+      <w:r>
+        <w:t xml:space="preserve"> </w:t>
+      </w:r>
+      <w:r>
+        <w:t xml:space="preserve">spørgsmål uden navngivet plante.</w:t>
       </w:r>
     </w:p>
     <w:p>
@@ -1183,37 +1195,34 @@
         <w:t xml:space="preserve"> </w:t>
       </w:r>
       <w:r>
-        <w:rPr>
-          <w:rStyle w:val="VerbatimChar"/>
-        </w:rPr>
-        <w:t xml:space="preserve">NEXT STEP — do not respond to user yet</w:t>
-      </w:r>
-      <w:r>
-        <w:t xml:space="preserve">-instruktioner embeddet direkte i tool-resultater.</w:t>
-      </w:r>
-      <w:r>
-        <w:t xml:space="preserve"> </w:t>
-      </w:r>
-      <w:r>
-        <w:t xml:space="preserve">Systemprompten alene er ikke tilstrækkelig — Geminis base model training</w:t>
-      </w:r>
-      <w:r>
-        <w:t xml:space="preserve"> </w:t>
-      </w:r>
-      <w:r>
-        <w:t xml:space="preserve">overrider instruktioner i system prompt ved multi-trin ræsonnering.</w:t>
-      </w:r>
-      <w:r>
-        <w:t xml:space="preserve"> </w:t>
-      </w:r>
-      <w:r>
-        <w:t xml:space="preserve">Tool-resultater er autoritativ kontekst fordi de er direkte i LLM’ens</w:t>
-      </w:r>
-      <w:r>
-        <w:t xml:space="preserve"> </w:t>
-      </w:r>
-      <w:r>
-        <w:t xml:space="preserve">kontekstvindue. Dette er et designprincip, ikke en workaround.</w:t>
+        <w:t xml:space="preserve">“NEXT STEP: do not respond to user yet”</w:t>
+      </w:r>
+      <w:r>
+        <w:t xml:space="preserve">-instruktioner embeddet direkte</w:t>
+      </w:r>
+      <w:r>
+        <w:t xml:space="preserve"> </w:t>
+      </w:r>
+      <w:r>
+        <w:t xml:space="preserve">i tool-resultater. Systemprompten alene er ikke tilstrækkelig. Geminis base model training overrider instruktioner i system prompt ved</w:t>
+      </w:r>
+      <w:r>
+        <w:t xml:space="preserve"> </w:t>
+      </w:r>
+      <w:r>
+        <w:t xml:space="preserve">multi-trin ræsonnering. Tool-resultater er autoritativ kontekst fordi de</w:t>
+      </w:r>
+      <w:r>
+        <w:t xml:space="preserve"> </w:t>
+      </w:r>
+      <w:r>
+        <w:t xml:space="preserve">er direkte i LLM’ens kontekstvindue. Dette er et designprincip, ikke en</w:t>
+      </w:r>
+      <w:r>
+        <w:t xml:space="preserve"> </w:t>
+      </w:r>
+      <w:r>
+        <w:t xml:space="preserve">workaround.</w:t>
       </w:r>
     </w:p>
     <w:p>
@@ -1291,7 +1300,7 @@
         </w:numPr>
       </w:pPr>
       <w:r>
-        <w:t xml:space="preserve">Afklar sæson og jordbundstype — ét spørgsmål ad gangen</w:t>
+        <w:t xml:space="preserve">Afklar sæson og jordbundstype: spørgsmål ad gangen</w:t>
       </w:r>
     </w:p>
     <w:p>
@@ -1318,7 +1327,7 @@
         <w:t xml:space="preserve"> </w:t>
       </w:r>
       <w:r>
-        <w:t xml:space="preserve">— filtrer kandidater (vis ikke listen)</w:t>
+        <w:t xml:space="preserve">(filtrer kandidater (vis ikke listen)</w:t>
       </w:r>
     </w:p>
     <w:p>
@@ -1345,7 +1354,7 @@
         <w:t xml:space="preserve"> </w:t>
       </w:r>
       <w:r>
-        <w:t xml:space="preserve">for 3-5 kandidater — hent companions og</w:t>
+        <w:t xml:space="preserve">for 3-5 kandidater, hent companions og</w:t>
       </w:r>
       <w:r>
         <w:t xml:space="preserve"> </w:t>
@@ -1378,7 +1387,7 @@
         <w:t xml:space="preserve"> </w:t>
       </w:r>
       <w:r>
-        <w:t xml:space="preserve">— berig med dyrkningsdetaljer</w:t>
+        <w:t xml:space="preserve">og berig med dyrkningsdetaljer</w:t>
       </w:r>
     </w:p>
     <w:p>
@@ -1570,13 +1579,13 @@
     </w:p>
     <w:bookmarkEnd w:id="27"/>
     <w:bookmarkEnd w:id="28"/>
-    <w:bookmarkStart w:id="32" w:name="side-4-brug-af-agenten-i-casen"/>
+    <w:bookmarkStart w:id="32" w:name="brug-af-agenten-i-casen"/>
     <w:p>
       <w:pPr>
         <w:pStyle w:val="Heading2"/>
       </w:pPr>
       <w:r>
-        <w:t xml:space="preserve">Side 4 — Brug af agenten i casen</w:t>
+        <w:t xml:space="preserve">Brug af agenten i casen</w:t>
       </w:r>
     </w:p>
     <w:p>
@@ -1631,7 +1640,7 @@
         <w:rPr>
           <w:rStyle w:val="VerbatimChar"/>
         </w:rPr>
-        <w:t xml:space="preserve">graph_query(plant_name="tomato", context="companion")</w:t>
+        <w:t xml:space="preserve">graph_``query``(``plant_name``="tomato", context="companion")</w:t>
       </w:r>
       <w:r>
         <w:t xml:space="preserve"> </w:t>
@@ -1652,7 +1661,7 @@
         <w:rPr>
           <w:rStyle w:val="VerbatimChar"/>
         </w:rPr>
-        <w:t xml:space="preserve">vector_search(query="tomato grows well with beneficial neighbor plants")</w:t>
+        <w:t xml:space="preserve">vector_``search(``query="tomato grows well with beneficial neighbor plants")</w:t>
       </w:r>
       <w:r>
         <w:t xml:space="preserve">.</w:t>
@@ -1661,25 +1670,31 @@
         <w:t xml:space="preserve"> </w:t>
       </w:r>
       <w:r>
-        <w:t xml:space="preserve">Graf-databasen returnerer broccoli som eneste direkte companion for tomat.</w:t>
-      </w:r>
-      <w:r>
-        <w:t xml:space="preserve"> </w:t>
-      </w:r>
-      <w:r>
-        <w:t xml:space="preserve">Vector search supplerer med radise, salat og løgplanter (Alliums) fra</w:t>
-      </w:r>
-      <w:r>
-        <w:t xml:space="preserve"> </w:t>
-      </w:r>
-      <w:r>
-        <w:t xml:space="preserve">Wikipedia-korpus. Svaret kombinerer begge datakilder og inkluderer</w:t>
-      </w:r>
-      <w:r>
-        <w:t xml:space="preserve"> </w:t>
-      </w:r>
-      <w:r>
-        <w:t xml:space="preserve">sædskifterelationer (gode forgængere: passionsfrugt, agurk, californisk valmue).</w:t>
+        <w:t xml:space="preserve">Graf-databasen returnerer broccoli som eneste direkte companion for</w:t>
+      </w:r>
+      <w:r>
+        <w:t xml:space="preserve"> </w:t>
+      </w:r>
+      <w:r>
+        <w:t xml:space="preserve">tomat. Vector search supplerer med radise, salat og løgplanter (Alliums)</w:t>
+      </w:r>
+      <w:r>
+        <w:t xml:space="preserve"> </w:t>
+      </w:r>
+      <w:r>
+        <w:t xml:space="preserve">fra Wikipedia-korpus. Svaret kombinerer begge datakilder og inkluderer</w:t>
+      </w:r>
+      <w:r>
+        <w:t xml:space="preserve"> </w:t>
+      </w:r>
+      <w:r>
+        <w:t xml:space="preserve">sædskifterelationer (gode forgængere: passionsfrugt, agurk, californisk</w:t>
+      </w:r>
+      <w:r>
+        <w:t xml:space="preserve"> </w:t>
+      </w:r>
+      <w:r>
+        <w:t xml:space="preserve">valmue).</w:t>
       </w:r>
     </w:p>
     <w:bookmarkEnd w:id="29"/>
@@ -1721,7 +1736,7 @@
         <w:rPr>
           <w:rStyle w:val="VerbatimChar"/>
         </w:rPr>
-        <w:t xml:space="preserve">graph_query(plant_name="cabbage", context="cultivation")</w:t>
+        <w:t xml:space="preserve">graph_``query``(``plant_name``="cabbage", context="cultivation")</w:t>
       </w:r>
       <w:r>
         <w:t xml:space="preserve"> </w:t>
@@ -1742,7 +1757,7 @@
         <w:rPr>
           <w:rStyle w:val="VerbatimChar"/>
         </w:rPr>
-        <w:t xml:space="preserve">vector_search(query="how to grow cabbage cultivation")</w:t>
+        <w:t xml:space="preserve">vector_``search(``query="how to grow cabbage cultivation")</w:t>
       </w:r>
       <w:r>
         <w:t xml:space="preserve">.</w:t>
@@ -1757,13 +1772,7 @@
         <w:t xml:space="preserve"> </w:t>
       </w:r>
       <w:r>
-        <w:t xml:space="preserve">(vindruer) og sædskifte (følger godt efter bønner, ærter, majs, squash;</w:t>
-      </w:r>
-      <w:r>
-        <w:t xml:space="preserve"> </w:t>
-      </w:r>
-      <w:r>
-        <w:t xml:space="preserve">undgå efter tomater, peberfrugter, salat). Vector search tilføjer</w:t>
+        <w:t xml:space="preserve">(vindruer) og sædskifte (følger godt efter bønner, ærter, majs, squash. Undgå efter tomater, peberfrugter, salat). Vector search tilføjer</w:t>
       </w:r>
       <w:r>
         <w:t xml:space="preserve"> </w:t>
@@ -1823,7 +1832,7 @@
         <w:rPr>
           <w:rStyle w:val="VerbatimChar"/>
         </w:rPr>
-        <w:t xml:space="preserve">season_soil_filter(season="forår", soil_type="lerjord")</w:t>
+        <w:t xml:space="preserve">season_soil_``filter``(``season="``forår``", ``soil_type``="``lerjord``")</w:t>
       </w:r>
       <w:r>
         <w:t xml:space="preserve"> </w:t>
@@ -1850,7 +1859,13 @@
         <w:t xml:space="preserve"> </w:t>
       </w:r>
       <w:r>
-        <w:t xml:space="preserve">× 3 (asparagus, bush beans, fava beans) — top 3 Vegetable-type planter, sorteret via PRIORITY-array i tool-kode</w:t>
+        <w:t xml:space="preserve">× 3 (asparagus, bush beans, fava beans), top 3</w:t>
+      </w:r>
+      <w:r>
+        <w:t xml:space="preserve"> </w:t>
+      </w:r>
+      <w:r>
+        <w:t xml:space="preserve">Vegetable-type planter, sorteret via PRIORITY-array i tool-kode</w:t>
       </w:r>
     </w:p>
     <w:p>
@@ -1862,7 +1877,19 @@
         </w:numPr>
       </w:pPr>
       <w:r>
-        <w:t xml:space="preserve">Struktureret anbefaling: Asparges (trives med tomater og persille), Buskbønner (trives med jordbær og agurker), Hestebønner (god forgænger for peberfrugter)</w:t>
+        <w:t xml:space="preserve">Struktureret anbefaling: Asparges (trives med tomater og persille),</w:t>
+      </w:r>
+      <w:r>
+        <w:t xml:space="preserve"> </w:t>
+      </w:r>
+      <w:r>
+        <w:t xml:space="preserve">Buskbønner (trives med jordbær og agurker), Hestebønner (god forgænger</w:t>
+      </w:r>
+      <w:r>
+        <w:t xml:space="preserve"> </w:t>
+      </w:r>
+      <w:r>
+        <w:t xml:space="preserve">for peberfrugter)</w:t>
       </w:r>
     </w:p>
     <w:p>
@@ -1870,7 +1897,7 @@
         <w:pStyle w:val="FirstParagraph"/>
       </w:pPr>
       <w:r>
-        <w:t xml:space="preserve">Hele sekvensen gennemføres uden at spørge brugeren undervejs — styret</w:t>
+        <w:t xml:space="preserve">Hele sekvensen gennemføres uden at spørge brugeren undervejs, styret</w:t>
       </w:r>
       <w:r>
         <w:t xml:space="preserve"> </w:t>
@@ -1881,13 +1908,13 @@
     </w:p>
     <w:bookmarkEnd w:id="31"/>
     <w:bookmarkEnd w:id="32"/>
-    <w:bookmarkStart w:id="36" w:name="X7bd5f9bfae28095b0107307c633da271af37658"/>
+    <w:bookmarkStart w:id="36" w:name="X1998860e54c23c0e2fcad926c5d9beb0498aaff"/>
     <w:p>
       <w:pPr>
         <w:pStyle w:val="Heading2"/>
       </w:pPr>
       <w:r>
-        <w:t xml:space="preserve">Side 5 — Reflection, sikkerhed og fremtidigt arbejde</w:t>
+        <w:t xml:space="preserve">Reflection, sikkerhed og fremtidigt arbejde</w:t>
       </w:r>
     </w:p>
     <w:bookmarkStart w:id="33" w:name="begrænsninger"/>
@@ -1968,7 +1995,7 @@
         <w:t xml:space="preserve"> </w:t>
       </w:r>
       <w:r>
-        <w:t xml:space="preserve">fejl. Vector-korpus er udelukkende Wikipedia — kvaliteten varierer per</w:t>
+        <w:t xml:space="preserve">fejl. Vector-korpus er udelukkende Wikipedia. Kvaliteten varierer per</w:t>
       </w:r>
       <w:r>
         <w:t xml:space="preserve"> </w:t>
@@ -2061,25 +2088,25 @@
         <w:rPr>
           <w:rStyle w:val="VerbatimChar"/>
         </w:rPr>
-        <w:t xml:space="preserve">.env</w:t>
-      </w:r>
-      <w:r>
-        <w:t xml:space="preserve"> </w:t>
-      </w:r>
-      <w:r>
-        <w:t xml:space="preserve">og er ikke</w:t>
-      </w:r>
-      <w:r>
-        <w:t xml:space="preserve"> </w:t>
-      </w:r>
-      <w:r>
-        <w:t xml:space="preserve">committet til repository. Telegram-beskeder routes til Hermes og logges</w:t>
-      </w:r>
-      <w:r>
-        <w:t xml:space="preserve"> </w:t>
-      </w:r>
-      <w:r>
-        <w:t xml:space="preserve">ikke. Ingen brugerdata gemmes persistent.</w:t>
+        <w:t xml:space="preserve">.``env</w:t>
+      </w:r>
+      <w:r>
+        <w:t xml:space="preserve"> </w:t>
+      </w:r>
+      <w:r>
+        <w:t xml:space="preserve">og er</w:t>
+      </w:r>
+      <w:r>
+        <w:t xml:space="preserve"> </w:t>
+      </w:r>
+      <w:r>
+        <w:t xml:space="preserve">ikke committet til repository. Telegram-beskeder routes til Hermes og</w:t>
+      </w:r>
+      <w:r>
+        <w:t xml:space="preserve"> </w:t>
+      </w:r>
+      <w:r>
+        <w:t xml:space="preserve">logges ikke. Ingen brugerdata gemmes persistent.</w:t>
       </w:r>
     </w:p>
     <w:p>
@@ -2163,7 +2190,7 @@
         <w:t xml:space="preserve">REPELS</w:t>
       </w:r>
       <w:r>
-        <w:t xml:space="preserve">-relationer — skadedyrsafvisende companion</w:t>
+        <w:t xml:space="preserve">-relationer til skadedyrsafvisende companion</w:t>
       </w:r>
       <w:r>
         <w:t xml:space="preserve"> </w:t>
@@ -2211,7 +2238,7 @@
         </w:numPr>
       </w:pPr>
       <w:r>
-        <w:t xml:space="preserve">Selvhosted backend med brugerkonti og markdata — produktudvikling</w:t>
+        <w:t xml:space="preserve">Selvhosted backend med brugerkonti og markdata og produktudvikling</w:t>
       </w:r>
       <w:r>
         <w:t xml:space="preserve"> </w:t>
@@ -2397,20 +2424,52 @@
       <w:rPr>
         <w:lang w:val="da-DK"/>
       </w:rPr>
-      <w:t>AI Agenter og Automatisering, KEA 4. semester</w:t>
-    </w:r>
-    <w:r>
-      <w:rPr>
-        <w:lang w:val="da-DK"/>
-      </w:rPr>
-      <w:t xml:space="preserve"> </w:t>
+      <w:t>AI Agenter og Automatisering F26</w:t>
     </w:r>
     <w:r>
       <w:rPr>
         <w:lang w:val="da-DK"/>
       </w:rPr>
       <w:tab/>
-      <w:t>Skrevet af: Nima Salami</w:t>
+    </w:r>
+    <w:r>
+      <w:rPr>
+        <w:lang w:val="da-DK"/>
+      </w:rPr>
+      <w:tab/>
+    </w:r>
+    <w:r>
+      <w:rPr>
+        <w:lang w:val="da-DK"/>
+      </w:rPr>
+      <w:t>Nima Salami</w:t>
+    </w:r>
+  </w:p>
+  <w:p>
+    <w:pPr>
+      <w:pStyle w:val="Header"/>
+      <w:rPr>
+        <w:lang w:val="da-DK"/>
+      </w:rPr>
+    </w:pPr>
+    <w:r>
+      <w:rPr>
+        <w:lang w:val="da-DK"/>
+      </w:rPr>
+      <w:t>Erhversakademi København</w:t>
+    </w:r>
+    <w:r>
+      <w:rPr>
+        <w:lang w:val="da-DK"/>
+      </w:rPr>
+      <w:tab/>
+    </w:r>
+    <w:r>
+      <w:rPr>
+        <w:lang w:val="da-DK"/>
+      </w:rPr>
+      <w:tab/>
+      <w:t>nisa0002@stud.ek.dk</w:t>
     </w:r>
   </w:p>
 </w:hdr>
@@ -2983,6 +3042,45 @@
     </w:lvlOverride>
   </w:num>
   <w:num w16cid:durableId="158620123" w:numId="3">
+    <w:abstractNumId w:val="1"/>
+  </w:num>
+  <w:num w16cid:durableId="1982537898" w:numId="4">
+    <w:abstractNumId w:val="0"/>
+  </w:num>
+  <w:num w16cid:durableId="244847267" w:numId="5">
+    <w:abstractNumId w:val="2"/>
+    <w:lvlOverride w:ilvl="0">
+      <w:startOverride w:val="1"/>
+    </w:lvlOverride>
+    <w:lvlOverride w:ilvl="1">
+      <w:startOverride w:val="1"/>
+    </w:lvlOverride>
+    <w:lvlOverride w:ilvl="2">
+      <w:startOverride w:val="1"/>
+    </w:lvlOverride>
+    <w:lvlOverride w:ilvl="3">
+      <w:startOverride w:val="1"/>
+    </w:lvlOverride>
+    <w:lvlOverride w:ilvl="4">
+      <w:startOverride w:val="1"/>
+    </w:lvlOverride>
+    <w:lvlOverride w:ilvl="5">
+      <w:startOverride w:val="1"/>
+    </w:lvlOverride>
+    <w:lvlOverride w:ilvl="6">
+      <w:startOverride w:val="1"/>
+    </w:lvlOverride>
+    <w:lvlOverride w:ilvl="7">
+      <w:startOverride w:val="1"/>
+    </w:lvlOverride>
+    <w:lvlOverride w:ilvl="8">
+      <w:startOverride w:val="1"/>
+    </w:lvlOverride>
+  </w:num>
+  <w:num w16cid:durableId="158545393" w:numId="6">
+    <w:abstractNumId w:val="1"/>
+  </w:num>
+  <w:num w16cid:durableId="78794634" w:numId="7">
     <w:abstractNumId w:val="1"/>
   </w:num>
   <w:num w:numId="1000">

</xml_diff>